<commit_message>
Iteration 2 transaction-split feature complete
</commit_message>
<xml_diff>
--- a/Iterations and Stories.docx
+++ b/Iterations and Stories.docx
@@ -1022,6 +1022,60 @@
       <w:r>
         <w:t>Could this app kind of be an alternative to Amazon, e.g. direct sales?</w:t>
       </w:r>
+    </w:p>
+    <w:p>
+      <w:pPr>
+        <w:pStyle w:val="ListParagraph"/>
+        <w:numPr>
+          <w:ilvl w:val="0"/>
+          <w:numId w:val="1"/>
+        </w:numPr>
+      </w:pPr>
+      <w:r>
+        <w:lastRenderedPageBreak/>
+        <w:t xml:space="preserve">As a user I would like the command line importer to use the special characters on top of the number keys to assign the entire amount to a single category in the list (shift-1, which </w:t>
+      </w:r>
+      <w:proofErr w:type="gramStart"/>
+      <w:r>
+        <w:t>is !</w:t>
+      </w:r>
+      <w:proofErr w:type="gramEnd"/>
+      <w:r>
+        <w:t>, becomes the special character for “assign entire amount to the first category”.</w:t>
+      </w:r>
+    </w:p>
+    <w:p>
+      <w:pPr>
+        <w:pStyle w:val="ListParagraph"/>
+        <w:numPr>
+          <w:ilvl w:val="0"/>
+          <w:numId w:val="1"/>
+        </w:numPr>
+      </w:pPr>
+      <w:r>
+        <w:t>As a user I would like the command line importer to immediately act when I enter a special character, and not make me hit enter.</w:t>
+      </w:r>
+    </w:p>
+    <w:p>
+      <w:pPr>
+        <w:pStyle w:val="ListParagraph"/>
+        <w:numPr>
+          <w:ilvl w:val="0"/>
+          <w:numId w:val="1"/>
+        </w:numPr>
+      </w:pPr>
+      <w:r>
+        <w:t>As a user I would like the command line importer to support a special character that means “edit the budget items assigned to this merchant”.</w:t>
+      </w:r>
+    </w:p>
+    <w:p>
+      <w:pPr>
+        <w:pStyle w:val="ListParagraph"/>
+        <w:numPr>
+          <w:ilvl w:val="0"/>
+          <w:numId w:val="1"/>
+        </w:numPr>
+      </w:pPr>
       <w:bookmarkStart w:id="0" w:name="_GoBack"/>
       <w:bookmarkEnd w:id="0"/>
       <w:r>
@@ -1038,7 +1092,6 @@
         </w:rPr>
       </w:pPr>
       <w:r>
-        <w:lastRenderedPageBreak/>
         <w:br w:type="page"/>
       </w:r>
     </w:p>
@@ -2633,7 +2686,7 @@
 </file>
 
 <file path=customXml/itemProps1.xml><?xml version="1.0" encoding="utf-8"?>
-<ds:datastoreItem xmlns:ds="http://schemas.openxmlformats.org/officeDocument/2006/customXml" ds:itemID="{F96C3143-F847-471A-BE08-736EB08B82E6}">
+<ds:datastoreItem xmlns:ds="http://schemas.openxmlformats.org/officeDocument/2006/customXml" ds:itemID="{DA8F82FF-0BA6-4EEC-AF13-AA37D2E4ECF5}">
   <ds:schemaRefs>
     <ds:schemaRef ds:uri="http://schemas.openxmlformats.org/officeDocument/2006/bibliography"/>
   </ds:schemaRefs>

</xml_diff>

<commit_message>
Forecast update logic complete.
</commit_message>
<xml_diff>
--- a/Iterations and Stories.docx
+++ b/Iterations and Stories.docx
@@ -1239,6 +1239,9 @@
       <w:r>
         <w:t xml:space="preserve"> I would like to enter only the first few letters.</w:t>
       </w:r>
+      <w:r>
+        <w:t xml:space="preserve">  </w:t>
+      </w:r>
     </w:p>
     <w:p>
       <w:pPr>
@@ -1250,22 +1253,30 @@
       </w:pPr>
       <w:r>
         <w:t>As a user I would like the concept of one-time categories.  For example, Fandango sells movie tickets so they are usually entertainment, but I might buy someone movie tickets for a gift.  I don’t want to be asked every time I buy tickets if it was a gift though.</w:t>
+      </w:r>
+      <w:r>
+        <w:t xml:space="preserve">  </w:t>
+      </w:r>
+    </w:p>
+    <w:p>
+      <w:pPr>
+        <w:pStyle w:val="ListParagraph"/>
+        <w:numPr>
+          <w:ilvl w:val="0"/>
+          <w:numId w:val="1"/>
+        </w:numPr>
+      </w:pPr>
+      <w:r>
+        <w:t>As a user I would like the system to commit my forecast at the beginning of every month so that I can refer back to it and trend analysis can be performed on it.</w:t>
+      </w:r>
+      <w:r>
+        <w:t xml:space="preserve">  The current forecast should also then be extended one month, or perhaps regenerated entirely</w:t>
       </w:r>
       <w:bookmarkStart w:id="0" w:name="_GoBack"/>
       <w:bookmarkEnd w:id="0"/>
       <w:r>
-        <w:br/>
-      </w:r>
-    </w:p>
-    <w:p>
-      <w:pPr>
-        <w:rPr>
-          <w:rFonts w:asciiTheme="majorHAnsi" w:eastAsiaTheme="majorEastAsia" w:hAnsiTheme="majorHAnsi" w:cstheme="majorBidi"/>
-          <w:color w:val="2F5496" w:themeColor="accent1" w:themeShade="BF"/>
-          <w:sz w:val="32"/>
-          <w:szCs w:val="32"/>
-        </w:rPr>
-      </w:pPr>
+        <w:t>.</w:t>
+      </w:r>
       <w:r>
         <w:br w:type="page"/>
       </w:r>
@@ -2861,7 +2872,7 @@
 </file>
 
 <file path=customXml/itemProps1.xml><?xml version="1.0" encoding="utf-8"?>
-<ds:datastoreItem xmlns:ds="http://schemas.openxmlformats.org/officeDocument/2006/customXml" ds:itemID="{98994DC2-D8AB-4B73-B184-2D75199412BE}">
+<ds:datastoreItem xmlns:ds="http://schemas.openxmlformats.org/officeDocument/2006/customXml" ds:itemID="{F32CCC20-2F33-42EA-BB15-859044F746FC}">
   <ds:schemaRefs>
     <ds:schemaRef ds:uri="http://schemas.openxmlformats.org/officeDocument/2006/bibliography"/>
   </ds:schemaRefs>

</xml_diff>

<commit_message>
Commit prior to updating the render spending report feature.
</commit_message>
<xml_diff>
--- a/Iterations and Stories.docx
+++ b/Iterations and Stories.docx
@@ -729,15 +729,7 @@
       </w:r>
       <w:proofErr w:type="gramEnd"/>
       <w:r>
-        <w:t xml:space="preserve"> envelope should get which gas purchases?  Say the husband and wife both work and the husband </w:t>
-      </w:r>
-      <w:proofErr w:type="gramStart"/>
-      <w:r>
-        <w:t>leaves</w:t>
-      </w:r>
-      <w:proofErr w:type="gramEnd"/>
-      <w:r>
-        <w:t xml:space="preserve"> at 7 and the wife leaves at </w:t>
+        <w:t xml:space="preserve"> envelope should get which gas purchases?  Say the husband and wife both work and the husband leaves at 7 and the wife leaves at </w:t>
       </w:r>
       <w:r>
         <w:t>7:30</w:t>
@@ -1270,13 +1262,23 @@
         <w:t>As a user I would like the system to commit my forecast at the beginning of every month so that I can refer back to it and trend analysis can be performed on it.</w:t>
       </w:r>
       <w:r>
-        <w:t xml:space="preserve">  The current forecast should also then be extended one month, or perhaps regenerated entirely</w:t>
+        <w:t xml:space="preserve">  The current forecast should also then be extended one month, or perhaps regenerated entirely.</w:t>
+      </w:r>
+    </w:p>
+    <w:p>
+      <w:pPr>
+        <w:pStyle w:val="ListParagraph"/>
+        <w:numPr>
+          <w:ilvl w:val="0"/>
+          <w:numId w:val="1"/>
+        </w:numPr>
+      </w:pPr>
+      <w:r>
+        <w:lastRenderedPageBreak/>
+        <w:t>As a DevOps engineer, I would like to have a feature that automatically prunes the forecasts and transaction registers.  It should archive the pruned transactions to the file system.</w:t>
       </w:r>
       <w:bookmarkStart w:id="0" w:name="_GoBack"/>
       <w:bookmarkEnd w:id="0"/>
-      <w:r>
-        <w:t>.</w:t>
-      </w:r>
       <w:r>
         <w:br w:type="page"/>
       </w:r>
@@ -2046,7 +2048,7 @@
       </w:pPr>
     </w:pPrDefault>
   </w:docDefaults>
-  <w:latentStyles w:defLockedState="0" w:defUIPriority="99" w:defSemiHidden="0" w:defUnhideWhenUsed="0" w:defQFormat="0" w:count="375">
+  <w:latentStyles w:defLockedState="0" w:defUIPriority="99" w:defSemiHidden="0" w:defUnhideWhenUsed="0" w:defQFormat="0" w:count="377">
     <w:lsdException w:name="Normal" w:uiPriority="0" w:qFormat="1"/>
     <w:lsdException w:name="heading 1" w:uiPriority="9" w:qFormat="1"/>
     <w:lsdException w:name="heading 2" w:semiHidden="1" w:uiPriority="9" w:unhideWhenUsed="1" w:qFormat="1"/>
@@ -2152,7 +2154,6 @@
     <w:lsdException w:name="HTML Sample" w:semiHidden="1" w:unhideWhenUsed="1"/>
     <w:lsdException w:name="HTML Typewriter" w:semiHidden="1" w:unhideWhenUsed="1"/>
     <w:lsdException w:name="HTML Variable" w:semiHidden="1" w:unhideWhenUsed="1"/>
-    <w:lsdException w:name="Normal Table" w:semiHidden="1" w:unhideWhenUsed="1"/>
     <w:lsdException w:name="annotation subject" w:semiHidden="1" w:unhideWhenUsed="1"/>
     <w:lsdException w:name="No List" w:semiHidden="1" w:unhideWhenUsed="1"/>
     <w:lsdException w:name="Outline List 1" w:semiHidden="1" w:unhideWhenUsed="1"/>
@@ -2198,11 +2199,9 @@
     <w:lsdException w:name="Table Subtle 1" w:semiHidden="1" w:unhideWhenUsed="1"/>
     <w:lsdException w:name="Table Subtle 2" w:semiHidden="1" w:unhideWhenUsed="1"/>
     <w:lsdException w:name="Table Web 1" w:semiHidden="1" w:unhideWhenUsed="1"/>
-    <w:lsdException w:name="Table Web 2" w:semiHidden="1" w:unhideWhenUsed="1"/>
     <w:lsdException w:name="Table Web 3" w:semiHidden="1" w:unhideWhenUsed="1"/>
     <w:lsdException w:name="Balloon Text" w:semiHidden="1" w:unhideWhenUsed="1"/>
     <w:lsdException w:name="Table Grid" w:uiPriority="39"/>
-    <w:lsdException w:name="Table Theme" w:semiHidden="1" w:unhideWhenUsed="1"/>
     <w:lsdException w:name="Placeholder Text" w:semiHidden="1"/>
     <w:lsdException w:name="No Spacing" w:uiPriority="1" w:qFormat="1"/>
     <w:lsdException w:name="Light Shading" w:uiPriority="60"/>
@@ -2422,6 +2421,8 @@
     <w:lsdException w:name="Smart Hyperlink" w:semiHidden="1" w:unhideWhenUsed="1"/>
     <w:lsdException w:name="Hashtag" w:semiHidden="1" w:unhideWhenUsed="1"/>
     <w:lsdException w:name="Unresolved Mention" w:semiHidden="1" w:unhideWhenUsed="1"/>
+    <w:lsdException w:name="Smart Link" w:semiHidden="1" w:unhideWhenUsed="1"/>
+    <w:lsdException w:name="Smart Link Error" w:semiHidden="1" w:unhideWhenUsed="1"/>
   </w:latentStyles>
   <w:style w:type="paragraph" w:default="1" w:styleId="Normal">
     <w:name w:val="Normal"/>
@@ -2872,7 +2873,7 @@
 </file>
 
 <file path=customXml/itemProps1.xml><?xml version="1.0" encoding="utf-8"?>
-<ds:datastoreItem xmlns:ds="http://schemas.openxmlformats.org/officeDocument/2006/customXml" ds:itemID="{F32CCC20-2F33-42EA-BB15-859044F746FC}">
+<ds:datastoreItem xmlns:ds="http://schemas.openxmlformats.org/officeDocument/2006/customXml" ds:itemID="{09DEAD8C-05E2-476E-9449-ACE1DBC13BE4}">
   <ds:schemaRefs>
     <ds:schemaRef ds:uri="http://schemas.openxmlformats.org/officeDocument/2006/bibliography"/>
   </ds:schemaRefs>

</xml_diff>

<commit_message>
Add roll up feature to Items of Interest report.
</commit_message>
<xml_diff>
--- a/Iterations and Stories.docx
+++ b/Iterations and Stories.docx
@@ -466,15 +466,7 @@
         </w:numPr>
       </w:pPr>
       <w:r>
-        <w:t xml:space="preserve">What would be really cool is to take a picture of what you are </w:t>
-      </w:r>
-      <w:proofErr w:type="gramStart"/>
-      <w:r>
-        <w:t>eating</w:t>
-      </w:r>
-      <w:proofErr w:type="gramEnd"/>
-      <w:r>
-        <w:t xml:space="preserve"> and have it automatically added to your food log.</w:t>
+        <w:t>What would be really cool is to take a picture of what you are eating and have it automatically added to your food log.</w:t>
       </w:r>
     </w:p>
     <w:p>
@@ -1276,6 +1268,18 @@
       <w:r>
         <w:lastRenderedPageBreak/>
         <w:t>As a DevOps engineer, I would like to have a feature that automatically prunes the forecasts and transaction registers.  It should archive the pruned transactions to the file system.</w:t>
+      </w:r>
+    </w:p>
+    <w:p>
+      <w:pPr>
+        <w:pStyle w:val="ListParagraph"/>
+        <w:numPr>
+          <w:ilvl w:val="0"/>
+          <w:numId w:val="1"/>
+        </w:numPr>
+      </w:pPr>
+      <w:r>
+        <w:t xml:space="preserve"> In the case of an envelope, the system should automatically divide the remaining amount required for an envelope by the time till the next occurrence of the envelope transaction in the forecast and create synthetic savings transactions for it.</w:t>
       </w:r>
       <w:bookmarkStart w:id="0" w:name="_GoBack"/>
       <w:bookmarkEnd w:id="0"/>
@@ -2048,7 +2052,7 @@
       </w:pPr>
     </w:pPrDefault>
   </w:docDefaults>
-  <w:latentStyles w:defLockedState="0" w:defUIPriority="99" w:defSemiHidden="0" w:defUnhideWhenUsed="0" w:defQFormat="0" w:count="377">
+  <w:latentStyles w:defLockedState="0" w:defUIPriority="99" w:defSemiHidden="0" w:defUnhideWhenUsed="0" w:defQFormat="0" w:count="376">
     <w:lsdException w:name="Normal" w:uiPriority="0" w:qFormat="1"/>
     <w:lsdException w:name="heading 1" w:uiPriority="9" w:qFormat="1"/>
     <w:lsdException w:name="heading 2" w:semiHidden="1" w:uiPriority="9" w:unhideWhenUsed="1" w:qFormat="1"/>
@@ -2154,6 +2158,7 @@
     <w:lsdException w:name="HTML Sample" w:semiHidden="1" w:unhideWhenUsed="1"/>
     <w:lsdException w:name="HTML Typewriter" w:semiHidden="1" w:unhideWhenUsed="1"/>
     <w:lsdException w:name="HTML Variable" w:semiHidden="1" w:unhideWhenUsed="1"/>
+    <w:lsdException w:name="Normal Table" w:semiHidden="1" w:unhideWhenUsed="1"/>
     <w:lsdException w:name="annotation subject" w:semiHidden="1" w:unhideWhenUsed="1"/>
     <w:lsdException w:name="No List" w:semiHidden="1" w:unhideWhenUsed="1"/>
     <w:lsdException w:name="Outline List 1" w:semiHidden="1" w:unhideWhenUsed="1"/>
@@ -2199,9 +2204,11 @@
     <w:lsdException w:name="Table Subtle 1" w:semiHidden="1" w:unhideWhenUsed="1"/>
     <w:lsdException w:name="Table Subtle 2" w:semiHidden="1" w:unhideWhenUsed="1"/>
     <w:lsdException w:name="Table Web 1" w:semiHidden="1" w:unhideWhenUsed="1"/>
+    <w:lsdException w:name="Table Web 2" w:semiHidden="1" w:unhideWhenUsed="1"/>
     <w:lsdException w:name="Table Web 3" w:semiHidden="1" w:unhideWhenUsed="1"/>
     <w:lsdException w:name="Balloon Text" w:semiHidden="1" w:unhideWhenUsed="1"/>
     <w:lsdException w:name="Table Grid" w:uiPriority="39"/>
+    <w:lsdException w:name="Table Theme" w:semiHidden="1" w:unhideWhenUsed="1"/>
     <w:lsdException w:name="Placeholder Text" w:semiHidden="1"/>
     <w:lsdException w:name="No Spacing" w:uiPriority="1" w:qFormat="1"/>
     <w:lsdException w:name="Light Shading" w:uiPriority="60"/>
@@ -2422,7 +2429,6 @@
     <w:lsdException w:name="Hashtag" w:semiHidden="1" w:unhideWhenUsed="1"/>
     <w:lsdException w:name="Unresolved Mention" w:semiHidden="1" w:unhideWhenUsed="1"/>
     <w:lsdException w:name="Smart Link" w:semiHidden="1" w:unhideWhenUsed="1"/>
-    <w:lsdException w:name="Smart Link Error" w:semiHidden="1" w:unhideWhenUsed="1"/>
   </w:latentStyles>
   <w:style w:type="paragraph" w:default="1" w:styleId="Normal">
     <w:name w:val="Normal"/>
@@ -2873,7 +2879,7 @@
 </file>
 
 <file path=customXml/itemProps1.xml><?xml version="1.0" encoding="utf-8"?>
-<ds:datastoreItem xmlns:ds="http://schemas.openxmlformats.org/officeDocument/2006/customXml" ds:itemID="{09DEAD8C-05E2-476E-9449-ACE1DBC13BE4}">
+<ds:datastoreItem xmlns:ds="http://schemas.openxmlformats.org/officeDocument/2006/customXml" ds:itemID="{48C17179-D77B-4B0E-8FC5-4617DA717DC9}">
   <ds:schemaRefs>
     <ds:schemaRef ds:uri="http://schemas.openxmlformats.org/officeDocument/2006/bibliography"/>
   </ds:schemaRefs>

</xml_diff>

<commit_message>
Import register transactions improvements.
</commit_message>
<xml_diff>
--- a/Iterations and Stories.docx
+++ b/Iterations and Stories.docx
@@ -1,6 +1,6 @@
 
 <file path=word/document.xml><?xml version="1.0" encoding="utf-8"?>
-<w:document xmlns:wpc="http://schemas.microsoft.com/office/word/2010/wordprocessingCanvas" xmlns:cx="http://schemas.microsoft.com/office/drawing/2014/chartex" xmlns:cx1="http://schemas.microsoft.com/office/drawing/2015/9/8/chartex" xmlns:cx2="http://schemas.microsoft.com/office/drawing/2015/10/21/chartex" xmlns:cx3="http://schemas.microsoft.com/office/drawing/2016/5/9/chartex" xmlns:cx4="http://schemas.microsoft.com/office/drawing/2016/5/10/chartex" xmlns:cx5="http://schemas.microsoft.com/office/drawing/2016/5/11/chartex" xmlns:cx6="http://schemas.microsoft.com/office/drawing/2016/5/12/chartex" xmlns:cx7="http://schemas.microsoft.com/office/drawing/2016/5/13/chartex" xmlns:cx8="http://schemas.microsoft.com/office/drawing/2016/5/14/chartex" xmlns:mc="http://schemas.openxmlformats.org/markup-compatibility/2006" xmlns:aink="http://schemas.microsoft.com/office/drawing/2016/ink" xmlns:am3d="http://schemas.microsoft.com/office/drawing/2017/model3d" xmlns:o="urn:schemas-microsoft-com:office:office" xmlns:r="http://schemas.openxmlformats.org/officeDocument/2006/relationships" xmlns:m="http://schemas.openxmlformats.org/officeDocument/2006/math" xmlns:v="urn:schemas-microsoft-com:vml" xmlns:wp14="http://schemas.microsoft.com/office/word/2010/wordprocessingDrawing" xmlns:wp="http://schemas.openxmlformats.org/drawingml/2006/wordprocessingDrawing" xmlns:w10="urn:schemas-microsoft-com:office:word" xmlns:w="http://schemas.openxmlformats.org/wordprocessingml/2006/main" xmlns:w14="http://schemas.microsoft.com/office/word/2010/wordml" xmlns:w15="http://schemas.microsoft.com/office/word/2012/wordml" xmlns:w16cid="http://schemas.microsoft.com/office/word/2016/wordml/cid" xmlns:w16se="http://schemas.microsoft.com/office/word/2015/wordml/symex" xmlns:wpg="http://schemas.microsoft.com/office/word/2010/wordprocessingGroup" xmlns:wpi="http://schemas.microsoft.com/office/word/2010/wordprocessingInk" xmlns:wne="http://schemas.microsoft.com/office/word/2006/wordml" xmlns:wps="http://schemas.microsoft.com/office/word/2010/wordprocessingShape" mc:Ignorable="w14 w15 w16se w16cid wp14">
+<w:document xmlns:wpc="http://schemas.microsoft.com/office/word/2010/wordprocessingCanvas" xmlns:cx="http://schemas.microsoft.com/office/drawing/2014/chartex" xmlns:cx1="http://schemas.microsoft.com/office/drawing/2015/9/8/chartex" xmlns:cx2="http://schemas.microsoft.com/office/drawing/2015/10/21/chartex" xmlns:cx3="http://schemas.microsoft.com/office/drawing/2016/5/9/chartex" xmlns:cx4="http://schemas.microsoft.com/office/drawing/2016/5/10/chartex" xmlns:cx5="http://schemas.microsoft.com/office/drawing/2016/5/11/chartex" xmlns:cx6="http://schemas.microsoft.com/office/drawing/2016/5/12/chartex" xmlns:cx7="http://schemas.microsoft.com/office/drawing/2016/5/13/chartex" xmlns:cx8="http://schemas.microsoft.com/office/drawing/2016/5/14/chartex" xmlns:mc="http://schemas.openxmlformats.org/markup-compatibility/2006" xmlns:aink="http://schemas.microsoft.com/office/drawing/2016/ink" xmlns:am3d="http://schemas.microsoft.com/office/drawing/2017/model3d" xmlns:o="urn:schemas-microsoft-com:office:office" xmlns:r="http://schemas.openxmlformats.org/officeDocument/2006/relationships" xmlns:m="http://schemas.openxmlformats.org/officeDocument/2006/math" xmlns:v="urn:schemas-microsoft-com:vml" xmlns:wp14="http://schemas.microsoft.com/office/word/2010/wordprocessingDrawing" xmlns:wp="http://schemas.openxmlformats.org/drawingml/2006/wordprocessingDrawing" xmlns:w10="urn:schemas-microsoft-com:office:word" xmlns:w="http://schemas.openxmlformats.org/wordprocessingml/2006/main" xmlns:w14="http://schemas.microsoft.com/office/word/2010/wordml" xmlns:w15="http://schemas.microsoft.com/office/word/2012/wordml" xmlns:w16cex="http://schemas.microsoft.com/office/word/2018/wordml/cex" xmlns:w16cid="http://schemas.microsoft.com/office/word/2016/wordml/cid" xmlns:w16="http://schemas.microsoft.com/office/word/2018/wordml" xmlns:w16sdtdh="http://schemas.microsoft.com/office/word/2020/wordml/sdtdatahash" xmlns:w16se="http://schemas.microsoft.com/office/word/2015/wordml/symex" xmlns:wpg="http://schemas.microsoft.com/office/word/2010/wordprocessingGroup" xmlns:wpi="http://schemas.microsoft.com/office/word/2010/wordprocessingInk" xmlns:wne="http://schemas.microsoft.com/office/word/2006/wordml" xmlns:wps="http://schemas.microsoft.com/office/word/2010/wordprocessingShape" mc:Ignorable="w14 w15 w16se w16cid w16 w16cex w16sdtdh wp14">
   <w:body>
     <w:p>
       <w:pPr>
@@ -187,15 +187,15 @@
         </w:numPr>
       </w:pPr>
       <w:r>
-        <w:t xml:space="preserve"> Budgeting:  As a user I want the system to </w:t>
+        <w:t xml:space="preserve"> Budgeting:  As a user I want the system to take into account my personality, </w:t>
       </w:r>
       <w:proofErr w:type="gramStart"/>
       <w:r>
-        <w:t>take into account</w:t>
+        <w:t>e.g.</w:t>
       </w:r>
       <w:proofErr w:type="gramEnd"/>
       <w:r>
-        <w:t xml:space="preserve"> my personality, e.g. am I a DIY kind of person, or pay someone for everything.</w:t>
+        <w:t xml:space="preserve"> am I a DIY kind of person, or pay someone for everything.</w:t>
       </w:r>
     </w:p>
     <w:p>
@@ -1114,7 +1114,15 @@
         <w:t>st</w:t>
       </w:r>
       <w:r>
-        <w:t xml:space="preserve"> of every month and spend $400.  I don’t know what budget items I will spend what amount of money on apriori.</w:t>
+        <w:t xml:space="preserve"> of every month and spend $400.  I don’t know what budget items I will spend what amount of money on </w:t>
+      </w:r>
+      <w:proofErr w:type="spellStart"/>
+      <w:r>
+        <w:t>apriori</w:t>
+      </w:r>
+      <w:proofErr w:type="spellEnd"/>
+      <w:r>
+        <w:t>.</w:t>
       </w:r>
     </w:p>
     <w:p>
@@ -1281,8 +1289,6 @@
       <w:r>
         <w:t xml:space="preserve"> In the case of an envelope, the system should automatically divide the remaining amount required for an envelope by the time till the next occurrence of the envelope transaction in the forecast and create synthetic savings transactions for it.</w:t>
       </w:r>
-      <w:bookmarkStart w:id="0" w:name="_GoBack"/>
-      <w:bookmarkEnd w:id="0"/>
       <w:r>
         <w:br w:type="page"/>
       </w:r>
@@ -1748,6 +1754,82 @@
     <w:p>
       <w:r>
         <w:t>Auto, home mortgage, home improvement, reverse mortgages</w:t>
+      </w:r>
+    </w:p>
+    <w:p/>
+    <w:p>
+      <w:pPr>
+        <w:pStyle w:val="Heading1"/>
+      </w:pPr>
+      <w:r>
+        <w:t>Concepts</w:t>
+      </w:r>
+    </w:p>
+    <w:p>
+      <w:r>
+        <w:t>How</w:t>
+      </w:r>
+      <w:r>
+        <w:t xml:space="preserve"> </w:t>
+      </w:r>
+      <w:r>
+        <w:t>Occurs:</w:t>
+      </w:r>
+    </w:p>
+    <w:p>
+      <w:pPr>
+        <w:pStyle w:val="ListParagraph"/>
+        <w:numPr>
+          <w:ilvl w:val="0"/>
+          <w:numId w:val="4"/>
+        </w:numPr>
+      </w:pPr>
+      <w:r>
+        <w:t xml:space="preserve">Collection category:  </w:t>
+      </w:r>
+    </w:p>
+    <w:p>
+      <w:pPr>
+        <w:pStyle w:val="ListParagraph"/>
+        <w:numPr>
+          <w:ilvl w:val="1"/>
+          <w:numId w:val="4"/>
+        </w:numPr>
+      </w:pPr>
+      <w:r>
+        <w:t>Set aside the money and then chip away at it with many transactions.</w:t>
+      </w:r>
+    </w:p>
+    <w:p>
+      <w:pPr>
+        <w:pStyle w:val="ListParagraph"/>
+        <w:numPr>
+          <w:ilvl w:val="0"/>
+          <w:numId w:val="4"/>
+        </w:numPr>
+      </w:pPr>
+      <w:r>
+        <w:t>Envelope</w:t>
+      </w:r>
+    </w:p>
+    <w:p>
+      <w:pPr>
+        <w:pStyle w:val="ListParagraph"/>
+        <w:numPr>
+          <w:ilvl w:val="1"/>
+          <w:numId w:val="4"/>
+        </w:numPr>
+      </w:pPr>
+      <w:r>
+        <w:t xml:space="preserve">Set aside money periodically, then spend it </w:t>
+      </w:r>
+      <w:proofErr w:type="gramStart"/>
+      <w:r>
+        <w:t>In</w:t>
+      </w:r>
+      <w:proofErr w:type="gramEnd"/>
+      <w:r>
+        <w:t xml:space="preserve"> a single transaction (car maintenance) or a flurry of closely spaced transactions (a vacation, or Christmas).</w:t>
       </w:r>
     </w:p>
     <w:p/>
@@ -1764,7 +1846,7 @@
 </file>
 
 <file path=word/numbering.xml><?xml version="1.0" encoding="utf-8"?>
-<w:numbering xmlns:wpc="http://schemas.microsoft.com/office/word/2010/wordprocessingCanvas" xmlns:cx="http://schemas.microsoft.com/office/drawing/2014/chartex" xmlns:cx1="http://schemas.microsoft.com/office/drawing/2015/9/8/chartex" xmlns:cx2="http://schemas.microsoft.com/office/drawing/2015/10/21/chartex" xmlns:cx3="http://schemas.microsoft.com/office/drawing/2016/5/9/chartex" xmlns:cx4="http://schemas.microsoft.com/office/drawing/2016/5/10/chartex" xmlns:cx5="http://schemas.microsoft.com/office/drawing/2016/5/11/chartex" xmlns:cx6="http://schemas.microsoft.com/office/drawing/2016/5/12/chartex" xmlns:cx7="http://schemas.microsoft.com/office/drawing/2016/5/13/chartex" xmlns:cx8="http://schemas.microsoft.com/office/drawing/2016/5/14/chartex" xmlns:mc="http://schemas.openxmlformats.org/markup-compatibility/2006" xmlns:aink="http://schemas.microsoft.com/office/drawing/2016/ink" xmlns:am3d="http://schemas.microsoft.com/office/drawing/2017/model3d" xmlns:o="urn:schemas-microsoft-com:office:office" xmlns:r="http://schemas.openxmlformats.org/officeDocument/2006/relationships" xmlns:m="http://schemas.openxmlformats.org/officeDocument/2006/math" xmlns:v="urn:schemas-microsoft-com:vml" xmlns:wp14="http://schemas.microsoft.com/office/word/2010/wordprocessingDrawing" xmlns:wp="http://schemas.openxmlformats.org/drawingml/2006/wordprocessingDrawing" xmlns:w10="urn:schemas-microsoft-com:office:word" xmlns:w="http://schemas.openxmlformats.org/wordprocessingml/2006/main" xmlns:w14="http://schemas.microsoft.com/office/word/2010/wordml" xmlns:w15="http://schemas.microsoft.com/office/word/2012/wordml" xmlns:w16cid="http://schemas.microsoft.com/office/word/2016/wordml/cid" xmlns:w16se="http://schemas.microsoft.com/office/word/2015/wordml/symex" xmlns:wpg="http://schemas.microsoft.com/office/word/2010/wordprocessingGroup" xmlns:wpi="http://schemas.microsoft.com/office/word/2010/wordprocessingInk" xmlns:wne="http://schemas.microsoft.com/office/word/2006/wordml" xmlns:wps="http://schemas.microsoft.com/office/word/2010/wordprocessingShape" mc:Ignorable="w14 w15 w16se w16cid wp14">
+<w:numbering xmlns:wpc="http://schemas.microsoft.com/office/word/2010/wordprocessingCanvas" xmlns:cx="http://schemas.microsoft.com/office/drawing/2014/chartex" xmlns:cx1="http://schemas.microsoft.com/office/drawing/2015/9/8/chartex" xmlns:cx2="http://schemas.microsoft.com/office/drawing/2015/10/21/chartex" xmlns:cx3="http://schemas.microsoft.com/office/drawing/2016/5/9/chartex" xmlns:cx4="http://schemas.microsoft.com/office/drawing/2016/5/10/chartex" xmlns:cx5="http://schemas.microsoft.com/office/drawing/2016/5/11/chartex" xmlns:cx6="http://schemas.microsoft.com/office/drawing/2016/5/12/chartex" xmlns:cx7="http://schemas.microsoft.com/office/drawing/2016/5/13/chartex" xmlns:cx8="http://schemas.microsoft.com/office/drawing/2016/5/14/chartex" xmlns:mc="http://schemas.openxmlformats.org/markup-compatibility/2006" xmlns:aink="http://schemas.microsoft.com/office/drawing/2016/ink" xmlns:am3d="http://schemas.microsoft.com/office/drawing/2017/model3d" xmlns:o="urn:schemas-microsoft-com:office:office" xmlns:r="http://schemas.openxmlformats.org/officeDocument/2006/relationships" xmlns:m="http://schemas.openxmlformats.org/officeDocument/2006/math" xmlns:v="urn:schemas-microsoft-com:vml" xmlns:wp14="http://schemas.microsoft.com/office/word/2010/wordprocessingDrawing" xmlns:wp="http://schemas.openxmlformats.org/drawingml/2006/wordprocessingDrawing" xmlns:w10="urn:schemas-microsoft-com:office:word" xmlns:w="http://schemas.openxmlformats.org/wordprocessingml/2006/main" xmlns:w14="http://schemas.microsoft.com/office/word/2010/wordml" xmlns:w15="http://schemas.microsoft.com/office/word/2012/wordml" xmlns:w16cex="http://schemas.microsoft.com/office/word/2018/wordml/cex" xmlns:w16cid="http://schemas.microsoft.com/office/word/2016/wordml/cid" xmlns:w16="http://schemas.microsoft.com/office/word/2018/wordml" xmlns:w16sdtdh="http://schemas.microsoft.com/office/word/2020/wordml/sdtdatahash" xmlns:w16se="http://schemas.microsoft.com/office/word/2015/wordml/symex" xmlns:wpg="http://schemas.microsoft.com/office/word/2010/wordprocessingGroup" xmlns:wpi="http://schemas.microsoft.com/office/word/2010/wordprocessingInk" xmlns:wne="http://schemas.microsoft.com/office/word/2006/wordml" xmlns:wps="http://schemas.microsoft.com/office/word/2010/wordprocessingShape" mc:Ignorable="w14 w15 w16se w16cid w16 w16cex w16sdtdh wp14">
   <w:abstractNum w:abstractNumId="0" w15:restartNumberingAfterBreak="0">
     <w:nsid w:val="1E317B7F"/>
     <w:multiLevelType w:val="hybridMultilevel"/>
@@ -2021,6 +2103,119 @@
       <w:pPr>
         <w:ind w:left="6480" w:hanging="180"/>
       </w:pPr>
+    </w:lvl>
+  </w:abstractNum>
+  <w:abstractNum w:abstractNumId="3" w15:restartNumberingAfterBreak="0">
+    <w:nsid w:val="4ABE19C2"/>
+    <w:multiLevelType w:val="hybridMultilevel"/>
+    <w:tmpl w:val="C5AAA5E6"/>
+    <w:lvl w:ilvl="0" w:tplc="04090001">
+      <w:start w:val="1"/>
+      <w:numFmt w:val="bullet"/>
+      <w:lvlText w:val=""/>
+      <w:lvlJc w:val="left"/>
+      <w:pPr>
+        <w:ind w:left="720" w:hanging="360"/>
+      </w:pPr>
+      <w:rPr>
+        <w:rFonts w:ascii="Symbol" w:hAnsi="Symbol" w:hint="default"/>
+      </w:rPr>
+    </w:lvl>
+    <w:lvl w:ilvl="1" w:tplc="04090003">
+      <w:start w:val="1"/>
+      <w:numFmt w:val="bullet"/>
+      <w:lvlText w:val="o"/>
+      <w:lvlJc w:val="left"/>
+      <w:pPr>
+        <w:ind w:left="1440" w:hanging="360"/>
+      </w:pPr>
+      <w:rPr>
+        <w:rFonts w:ascii="Courier New" w:hAnsi="Courier New" w:cs="Courier New" w:hint="default"/>
+      </w:rPr>
+    </w:lvl>
+    <w:lvl w:ilvl="2" w:tplc="04090005" w:tentative="1">
+      <w:start w:val="1"/>
+      <w:numFmt w:val="bullet"/>
+      <w:lvlText w:val=""/>
+      <w:lvlJc w:val="left"/>
+      <w:pPr>
+        <w:ind w:left="2160" w:hanging="360"/>
+      </w:pPr>
+      <w:rPr>
+        <w:rFonts w:ascii="Wingdings" w:hAnsi="Wingdings" w:hint="default"/>
+      </w:rPr>
+    </w:lvl>
+    <w:lvl w:ilvl="3" w:tplc="04090001" w:tentative="1">
+      <w:start w:val="1"/>
+      <w:numFmt w:val="bullet"/>
+      <w:lvlText w:val=""/>
+      <w:lvlJc w:val="left"/>
+      <w:pPr>
+        <w:ind w:left="2880" w:hanging="360"/>
+      </w:pPr>
+      <w:rPr>
+        <w:rFonts w:ascii="Symbol" w:hAnsi="Symbol" w:hint="default"/>
+      </w:rPr>
+    </w:lvl>
+    <w:lvl w:ilvl="4" w:tplc="04090003" w:tentative="1">
+      <w:start w:val="1"/>
+      <w:numFmt w:val="bullet"/>
+      <w:lvlText w:val="o"/>
+      <w:lvlJc w:val="left"/>
+      <w:pPr>
+        <w:ind w:left="3600" w:hanging="360"/>
+      </w:pPr>
+      <w:rPr>
+        <w:rFonts w:ascii="Courier New" w:hAnsi="Courier New" w:cs="Courier New" w:hint="default"/>
+      </w:rPr>
+    </w:lvl>
+    <w:lvl w:ilvl="5" w:tplc="04090005" w:tentative="1">
+      <w:start w:val="1"/>
+      <w:numFmt w:val="bullet"/>
+      <w:lvlText w:val=""/>
+      <w:lvlJc w:val="left"/>
+      <w:pPr>
+        <w:ind w:left="4320" w:hanging="360"/>
+      </w:pPr>
+      <w:rPr>
+        <w:rFonts w:ascii="Wingdings" w:hAnsi="Wingdings" w:hint="default"/>
+      </w:rPr>
+    </w:lvl>
+    <w:lvl w:ilvl="6" w:tplc="04090001" w:tentative="1">
+      <w:start w:val="1"/>
+      <w:numFmt w:val="bullet"/>
+      <w:lvlText w:val=""/>
+      <w:lvlJc w:val="left"/>
+      <w:pPr>
+        <w:ind w:left="5040" w:hanging="360"/>
+      </w:pPr>
+      <w:rPr>
+        <w:rFonts w:ascii="Symbol" w:hAnsi="Symbol" w:hint="default"/>
+      </w:rPr>
+    </w:lvl>
+    <w:lvl w:ilvl="7" w:tplc="04090003" w:tentative="1">
+      <w:start w:val="1"/>
+      <w:numFmt w:val="bullet"/>
+      <w:lvlText w:val="o"/>
+      <w:lvlJc w:val="left"/>
+      <w:pPr>
+        <w:ind w:left="5760" w:hanging="360"/>
+      </w:pPr>
+      <w:rPr>
+        <w:rFonts w:ascii="Courier New" w:hAnsi="Courier New" w:cs="Courier New" w:hint="default"/>
+      </w:rPr>
+    </w:lvl>
+    <w:lvl w:ilvl="8" w:tplc="04090005" w:tentative="1">
+      <w:start w:val="1"/>
+      <w:numFmt w:val="bullet"/>
+      <w:lvlText w:val=""/>
+      <w:lvlJc w:val="left"/>
+      <w:pPr>
+        <w:ind w:left="6480" w:hanging="360"/>
+      </w:pPr>
+      <w:rPr>
+        <w:rFonts w:ascii="Wingdings" w:hAnsi="Wingdings" w:hint="default"/>
+      </w:rPr>
     </w:lvl>
   </w:abstractNum>
   <w:num w:numId="1">
@@ -2032,11 +2227,14 @@
   <w:num w:numId="3">
     <w:abstractNumId w:val="0"/>
   </w:num>
+  <w:num w:numId="4">
+    <w:abstractNumId w:val="3"/>
+  </w:num>
 </w:numbering>
 </file>
 
 <file path=word/styles.xml><?xml version="1.0" encoding="utf-8"?>
-<w:styles xmlns:mc="http://schemas.openxmlformats.org/markup-compatibility/2006" xmlns:r="http://schemas.openxmlformats.org/officeDocument/2006/relationships" xmlns:w="http://schemas.openxmlformats.org/wordprocessingml/2006/main" xmlns:w14="http://schemas.microsoft.com/office/word/2010/wordml" xmlns:w15="http://schemas.microsoft.com/office/word/2012/wordml" xmlns:w16cid="http://schemas.microsoft.com/office/word/2016/wordml/cid" xmlns:w16se="http://schemas.microsoft.com/office/word/2015/wordml/symex" mc:Ignorable="w14 w15 w16se w16cid">
+<w:styles xmlns:mc="http://schemas.openxmlformats.org/markup-compatibility/2006" xmlns:r="http://schemas.openxmlformats.org/officeDocument/2006/relationships" xmlns:w="http://schemas.openxmlformats.org/wordprocessingml/2006/main" xmlns:w14="http://schemas.microsoft.com/office/word/2010/wordml" xmlns:w15="http://schemas.microsoft.com/office/word/2012/wordml" xmlns:w16cex="http://schemas.microsoft.com/office/word/2018/wordml/cex" xmlns:w16cid="http://schemas.microsoft.com/office/word/2016/wordml/cid" xmlns:w16="http://schemas.microsoft.com/office/word/2018/wordml" xmlns:w16sdtdh="http://schemas.microsoft.com/office/word/2020/wordml/sdtdatahash" xmlns:w16se="http://schemas.microsoft.com/office/word/2015/wordml/symex" mc:Ignorable="w14 w15 w16se w16cid w16 w16cex w16sdtdh">
   <w:docDefaults>
     <w:rPrDefault>
       <w:rPr>

</xml_diff>